<commit_message>
fix: compiling issues,updated model
</commit_message>
<xml_diff>
--- a/report/data_dictionary.docx
+++ b/report/data_dictionary.docx
@@ -2091,7 +2091,7 @@
         <w:pStyle w:val="FirstParagraph"/>
       </w:pPr>
       <w:r>
-        <w:t xml:space="preserve">The model uses fourteen features. Mortality indicators are deliberately excluded to</w:t>
+        <w:t xml:space="preserve">The model uses 16 features. Mortality indicators are deliberately excluded to</w:t>
       </w:r>
       <w:r>
         <w:t xml:space="preserve"> </w:t>
@@ -2963,7 +2963,7 @@
         <w:t xml:space="preserve"> </w:t>
       </w:r>
       <w:r>
-        <w:t xml:space="preserve">out-of-source MAE from 2.65 to 2.08 years, and SHAP ranks sanitation as the top driver.</w:t>
+        <w:t xml:space="preserve">out-of-source MAE from 2.65 to 1.96 years, and SHAP ranks sanitation as the top driver.</w:t>
       </w:r>
     </w:p>
     <w:bookmarkStart w:id="11" w:name="engineering-rationale"/>

</xml_diff>